<commit_message>
Sprint 2: Reporte de Insights alineado con el Informe Tecnico del Sprint 2
Co-Authored-By: Claude Sonnet 5.5 <noreply@anthropic.com>
Claude-Session: https://claude.ai/code/session_01PNf66jJFaujFG7BHCQCzXL
</commit_message>
<xml_diff>
--- a/04_Documentacion/PP1-PLA-S2-Reporte_de_Insights_Equipo2.docx
+++ b/04_Documentacion/PP1-PLA-S2-Reporte_de_Insights_Equipo2.docx
@@ -415,7 +415,7 @@
               <w:rPr>
                 <w:rtl w:val="0"/>
               </w:rPr>
-              <w:t xml:space="preserve">Más incendios registrados, pero cada vez menos hectáreas quemadas</w:t>
+              <w:t xml:space="preserve">Cantidad de incendios y superficie afectada siguen comportamientos distintos</w:t>
             </w:r>
           </w:p>
         </w:tc>
@@ -514,7 +514,7 @@
               <w:rPr>
                 <w:rtl w:val="0"/>
               </w:rPr>
-              <w:t xml:space="preserve">Tendencia temporal / Gravedad de los incendios</w:t>
+              <w:t xml:space="preserve">Relación entre variables / Gravedad de los incendios</w:t>
             </w:r>
           </w:p>
         </w:tc>
@@ -618,7 +618,7 @@
               <w:rPr>
                 <w:rtl w:val="0"/>
               </w:rPr>
-              <w:t xml:space="preserve">Entre 2020 y 2025 la cantidad de incendios registrados creció (1.743 en 2020; máximo de 2.750 en 2024), pero las hectáreas quemadas cayeron (984.157 ha en 2020; 306.456 ha en 2024). Como resultado, el promedio por incendio bajó de unas 565 ha (2020) a unas 111 ha (2024) y se mantuvo bajo en 2025 (unas 262 ha).</w:t>
+              <w:t xml:space="preserve">La cantidad de incendios y la superficie afectada no evolucionan de la misma manera. 2024 es el año con más incendios (2.707) y, sin embargo, con la menor superficie afectada (0,25 millones de hectáreas); 2020 tuvo menos incendios (1.720) pero la mayor superficie (1,00 millones). El NOA concentra el 49,2 % de los incendios pero solo el 10,1 % de las hectáreas; en cambio, la Pampeana reúne el 8,2 % de los incendios y el 22,2 % de las hectáreas. En el gráfico de burbujas, las provincias con más incendios no son necesariamente las de mayor superficie afectada.</w:t>
             </w:r>
           </w:p>
         </w:tc>
@@ -719,7 +719,7 @@
               <w:rPr>
                 <w:rtl w:val="0"/>
               </w:rPr>
-              <w:t xml:space="preserve">Cantidad de incendios por año (rii_a / rii_b), hectáreas quemadas por año (rii_c) y hectáreas por incendio (calculada: hectáreas ÷ incendios). Período 2020–2025; 2026 excluido por ser parcial (hasta marzo).</w:t>
+              <w:t xml:space="preserve">Cantidad de incendios y superficie afectada (hectáreas) por provincia, región y año, período 2020–2025 (tablas IncendioForestal_2020_2026 y cant_hect_incen_prov_2020_2026). Hectáreas por incendio: 267 en el total del período. Página "Cantidad vs superficie" del tablero.</w:t>
             </w:r>
           </w:p>
         </w:tc>
@@ -820,7 +820,7 @@
               <w:rPr>
                 <w:rtl w:val="0"/>
               </w:rPr>
-              <w:t xml:space="preserve">Medio. Son series oficiales completas a nivel nacional, pero con pocos años (6) y valores "s/d" en algunas provincias.</w:t>
+              <w:t xml:space="preserve">Medio. Los datos se reconstruyeron a partir de los reportes mensuales del SNMF y los valores "s/d" se reemplazaron por 0 (puede confundir "sin incendios" con "sin dato"). Además, esta página suma 13.326 incendios y la de regiones 13.486, porque excluye los parques nacionales de 2020.</w:t>
             </w:r>
           </w:p>
         </w:tc>
@@ -922,7 +922,7 @@
               <w:rPr>
                 <w:rtl w:val="0"/>
               </w:rPr>
-              <w:t xml:space="preserve">Contar incendios no alcanza para medir el daño: más incendios no significa más superficie perdida. Una posible explicación es una mejor detección y registro de focos chicos, o una respuesta más rápida; los datasets no incluyen causa ni tiempos de respuesta, así que esto queda como hipótesis y no como conclusión.</w:t>
+              <w:t xml:space="preserve">No se observa una relación directa entre la cantidad de incendios y la superficie afectada. El tamaño promedio de los incendios difiere según la región y el año, por lo que contar incendios no alcanza para dimensionar la superficie afectada: ambas variables aportan información diferente y deben leerse en conjunto.</w:t>
             </w:r>
           </w:p>
         </w:tc>
@@ -1022,7 +1022,7 @@
               <w:rPr>
                 <w:rtl w:val="0"/>
               </w:rPr>
-              <w:t xml:space="preserve">Si se ignora, un informe que mida solo la cantidad de incendios podría concluir que la situación empeora cuando la superficie quemada no lo muestra. Si se actúa sobre esto, los indicadores del proyecto pasan a ser hectáreas y hectáreas por incendio, no solo conteos.</w:t>
+              <w:t xml:space="preserve">Si se ignora, un análisis que mida solo la cantidad de incendios podría concluir que la situación empeora (o mejora) cuando la superficie afectada muestra otra cosa. Si se actúa, el proyecto usa ambas variables en conjunto al comunicar los resultados.</w:t>
             </w:r>
           </w:p>
         </w:tc>
@@ -1124,7 +1124,7 @@
               <w:rPr>
                 <w:rtl w:val="0"/>
               </w:rPr>
-              <w:t xml:space="preserve">Usar las hectáreas por incendio como indicador principal del análisis y presentarlo junto con la cantidad de incendios. Aclarar en el informe que la explicación (detección vs. combate) es una hipótesis.</w:t>
+              <w:t xml:space="preserve">Presentar siempre la cantidad de incendios junto con la superficie afectada, y apoyarse en las hectáreas por incendio para comparar regiones y años.</w:t>
             </w:r>
           </w:p>
         </w:tc>
@@ -1224,7 +1224,7 @@
               <w:rPr>
                 <w:rtl w:val="0"/>
               </w:rPr>
-              <w:t xml:space="preserve">Media</w:t>
+              <w:t xml:space="preserve">Alta</w:t>
             </w:r>
           </w:p>
         </w:tc>
@@ -1324,7 +1324,7 @@
               <w:rPr>
                 <w:rtl w:val="0"/>
               </w:rPr>
-              <w:t xml:space="preserve">Sí. Incorporar la columna calculada "hectáreas por incendio" en el modelo de datos y las visualizaciones del Sprint 3. Si fuera posible, buscar un dato de cantidad de brigadistas o de tiempo de respuesta para contrastar la hipótesis.</w:t>
+              <w:t xml:space="preserve">Sí. En el Sprint 3, diseñar el producto de visualización y construir la narrativa (data storytelling) con ambas variables juntas. Documentar la limitación de los valores "s/d" reemplazados por 0.</w:t>
             </w:r>
           </w:p>
         </w:tc>
@@ -1677,7 +1677,7 @@
               <w:rPr>
                 <w:rtl w:val="0"/>
               </w:rPr>
-              <w:t xml:space="preserve">Patagonia: pocos incendios, pero muy grandes, y en 2026 concentra casi todo el daño nacional</w:t>
+              <w:t xml:space="preserve">Los focos de calor se concentran en pocas provincias del norte y el litoral y en la segunda mitad del año</w:t>
             </w:r>
           </w:p>
         </w:tc>
@@ -1776,7 +1776,7 @@
               <w:rPr>
                 <w:rtl w:val="0"/>
               </w:rPr>
-              <w:t xml:space="preserve">Distribución geográfica / Gravedad de los incendios</w:t>
+              <w:t xml:space="preserve">Distribución territorial y temporal</w:t>
             </w:r>
           </w:p>
         </w:tc>
@@ -1880,7 +1880,7 @@
               <w:rPr>
                 <w:rtl w:val="0"/>
               </w:rPr>
-              <w:t xml:space="preserve">En Chubut, 2022 tuvo 39 incendios y 80.294 ha (unas 2.059 ha por incendio) y 2025 tuvo 64 incendios y 88.439 ha (unas 1.382 ha por incendio). En enero–marzo de 2026, Chubut ya acumula 32.761 ha con solo 20 incendios, el 62% de las 52.989 ha del país. La Patagonia registra 63 de los 186 incendios del trimestre (34%), mientras que en 2020–2025 su participación fue de alrededor del 10%.</w:t>
+              <w:t xml:space="preserve">Los focos de calor no se distribuyen de manera uniforme. Santa Fe, Formosa y Corrientes registran los valores más altos (0,22, 0,20 y 0,16 millones de focos), seguidas por Chaco y Santiago del Estero; estas cinco reúnen alrededor del 60 % del total del período (1,31 millones). Mendoza, Río Negro, La Pampa, San Luis y Jujuy presentan cantidades muy bajas. 2020 es el año con más focos (405.904), seguido por 2022 (287.685). En el acumulado, los focos se concentran entre agosto y octubre, con el máximo en agosto (0,27 millones).</w:t>
             </w:r>
           </w:p>
         </w:tc>
@@ -1981,7 +1981,7 @@
               <w:rPr>
                 <w:rtl w:val="0"/>
               </w:rPr>
-              <w:t xml:space="preserve">Hectáreas por provincia y año (rii_c), incendios por provincia (rii_b) e incendios por región (rii_e). Además, focos de calor por mes (rii_d): en Chubut el 69% se concentra en enero y febrero, y el pico nacional de incendios registrados es en julio–octubre.</w:t>
+              <w:t xml:space="preserve">Focos de calor por jurisdicción, año y mes, 2020–2025 (tabla cant_focos_prov_mes_2020_2026 y cant_total_focos_año). Página "Focos de calor" del tablero.</w:t>
             </w:r>
           </w:p>
         </w:tc>
@@ -2082,7 +2082,7 @@
               <w:rPr>
                 <w:rtl w:val="0"/>
               </w:rPr>
-              <w:t xml:space="preserve">Medio. Los datos oficiales son consistentes, pero 2026 es un año parcial (solo hasta marzo) y la comparación se basa en pocos eventos grandes.</w:t>
+              <w:t xml:space="preserve">Medio. La tabla está completa (1.920 registros, 24 jurisdicciones × 80 meses, sin celdas vacías), pero los focos de calor son una medición satelital y no equivalen a incendios registrados.</w:t>
             </w:r>
           </w:p>
         </w:tc>
@@ -2184,7 +2184,7 @@
               <w:rPr>
                 <w:rtl w:val="0"/>
               </w:rPr>
-              <w:t xml:space="preserve">La Patagonia no se comporta como el resto del país: su temporada es el verano, no el invierno-primavera, y pocos incendios explican gran parte de la superficie perdida. Por eso mirar solo el promedio nacional oculta el problema patagónico. Los datasets no explican las causas.</w:t>
+              <w:t xml:space="preserve">La distribución territorial de los focos es desigual: pocas provincias concentran la mayor parte de los registros y muchas otras aportan una porción mínima. El comportamiento temporal también lo es: 2020 se aleja del resto del período y, dentro del año, los focos se concentran en unos pocos meses.</w:t>
             </w:r>
           </w:p>
         </w:tc>
@@ -2284,7 +2284,7 @@
               <w:rPr>
                 <w:rtl w:val="0"/>
               </w:rPr>
-              <w:t xml:space="preserve">Si se ignora, la prevención se concentra en la temporada y las provincias que dominan el conteo (Tucumán, Jujuy) y se subestima el riesgo patagónico, donde un solo incendio puede ser decisivo. Si se actúa, se justifica reforzar el monitoreo en Chubut y la Patagonia entre diciembre y marzo.</w:t>
+              <w:t xml:space="preserve">Si se ignora, se podrían repartir los esfuerzos de prevención y monitoreo de forma pareja entre provincias y meses. Si se actúa, el seguimiento se concentra donde y cuando se concentran los focos.</w:t>
             </w:r>
           </w:p>
         </w:tc>
@@ -2386,7 +2386,7 @@
               <w:rPr>
                 <w:rtl w:val="0"/>
               </w:rPr>
-              <w:t xml:space="preserve">Incluir la Patagonia como una región con perfil propio en el informe. Destacar a Chubut como caso de estudio y mostrar la estacionalidad (enero–marzo) frente al resto del país.</w:t>
+              <w:t xml:space="preserve">Priorizar el análisis y la comunicación de las provincias del norte y el litoral y de la segunda mitad del año (agosto a octubre), y tratar 2020 como un año atípico.</w:t>
             </w:r>
           </w:p>
         </w:tc>
@@ -2486,7 +2486,7 @@
               <w:rPr>
                 <w:rtl w:val="0"/>
               </w:rPr>
-              <w:t xml:space="preserve">Alta</w:t>
+              <w:t xml:space="preserve">Media</w:t>
             </w:r>
           </w:p>
         </w:tc>
@@ -2586,7 +2586,7 @@
               <w:rPr>
                 <w:rtl w:val="0"/>
               </w:rPr>
-              <w:t xml:space="preserve">Sí. Actualizar el análisis cuando haya datos de 2026 completos. Evaluar usar el Reporte mensual de alerta temprana del Servicio Nacional de Manejo del Fuego (clima y vegetación) como contexto, sin mezclarlo con los datasets de incendios.</w:t>
+              <w:t xml:space="preserve">Sí. Incluir en el Sprint 3 la visualización de la concentración territorial y temporal de los focos. Los datos de 2026 se excluyeron por ser parciales; evaluar sumarlos cuando estén completos.</w:t>
             </w:r>
           </w:p>
         </w:tc>
@@ -2939,7 +2939,7 @@
               <w:rPr>
                 <w:rtl w:val="0"/>
               </w:rPr>
-              <w:t xml:space="preserve">El récord de incendios de 2024 lo explica una sola región: el NEA</w:t>
+              <w:t xml:space="preserve">El NOA concentra cerca de la mitad de los incendios durante todo el período</w:t>
             </w:r>
           </w:p>
         </w:tc>
@@ -3038,7 +3038,7 @@
               <w:rPr>
                 <w:rtl w:val="0"/>
               </w:rPr>
-              <w:t xml:space="preserve">Anomalía / Distribución geográfica</w:t>
+              <w:t xml:space="preserve">Distribución geográfica / Comportamiento regional</w:t>
             </w:r>
           </w:p>
         </w:tc>
@@ -3142,7 +3142,7 @@
               <w:rPr>
                 <w:rtl w:val="0"/>
               </w:rPr>
-              <w:t xml:space="preserve">En 2024 hubo 2.750 incendios, el máximo del período. El NEA aportó 793 de ellos (29%), frente a 70 en 2025 y 163 en 2023. Sin el NEA, 2024 habría tenido unos 1.950 incendios, menos que 2021, 2022 y 2023. Entre febrero y abril de 2024 se concentraron 903 incendios (340, 380 y 183 por mes), muy por encima de lo habitual en esos meses.</w:t>
+              <w:t xml:space="preserve">El NOA concentra la mayor cantidad de incendios (6.720 de 13.486, cerca de la mitad del período) y es la región con más incendios en todos los años analizados. Las demás regiones tienen valores bastante menores y más cercanos entre sí: Centro 1.852, NEA 1.598, Patagonia 1.329, Pampeana 1.088 y Norte 899. Su peso cambia de un año a otro: el Norte baja de 348 incendios en 2020 a 11 en 2025, y el NEA tiene un aumento marcado en 2024 (793) que no se mantiene al año siguiente (70). A nivel total, 2022 (2.657) y 2024 (2.749) son los años con más incendios.</w:t>
             </w:r>
           </w:p>
         </w:tc>
@@ -3243,7 +3243,7 @@
               <w:rPr>
                 <w:rtl w:val="0"/>
               </w:rPr>
-              <w:t xml:space="preserve">Incendios por región y año (rii_e) e incendios por mes y año (rii_a). Período 2020–2025.</w:t>
+              <w:t xml:space="preserve">Cantidad de incendios por región y año, 2020–2025 (tabla cant_incen_regi_2020_2026, 6 regiones × 7 años). Página "Incendios por región" del tablero.</w:t>
             </w:r>
           </w:p>
         </w:tc>
@@ -3344,7 +3344,7 @@
               <w:rPr>
                 <w:rtl w:val="0"/>
               </w:rPr>
-              <w:t xml:space="preserve">Medio. Los datos son oficiales, pero no indican la causa del episodio ni qué provincias lo explican dentro del NEA.</w:t>
+              <w:t xml:space="preserve">Medio. Los totales regionales provienen de reportes mensuales del SNMF y esta página suma 13.486 incendios (incluye parques nacionales de 2020), frente a 13.326 de la página "Cantidad vs superficie".</w:t>
             </w:r>
           </w:p>
         </w:tc>
@@ -3446,7 +3446,7 @@
               <w:rPr>
                 <w:rtl w:val="0"/>
               </w:rPr>
-              <w:t xml:space="preserve">El máximo de 2024 fue un episodio concentrado en el tiempo y el espacio (verano en el NEA), no un aumento generalizado en todo el país. Leer solo el total nacional lleva a una tendencia que no existe de la misma forma en las regiones.</w:t>
+              <w:t xml:space="preserve">La distribución de los incendios entre regiones es desigual, con una región que se destaca claramente sobre las demás. Esa distribución no es fija: la participación de las regiones varía entre años, aunque el liderazgo del NOA se mantiene.</w:t>
             </w:r>
           </w:p>
         </w:tc>
@@ -3546,7 +3546,7 @@
               <w:rPr>
                 <w:rtl w:val="0"/>
               </w:rPr>
-              <w:t xml:space="preserve">Si se ignora, se podría interpretar 2024 como el inicio de una tendencia nacional al alza. Si se actúa, el análisis separa la tendencia estructural de los episodios extremos.</w:t>
+              <w:t xml:space="preserve">Si se ignora, el análisis nacional puede ocultar que una sola región explica casi la mitad de los incendios y que algunos picos (como el NEA en 2024) son episodios de un año. Si se actúa, se separa la concentración estable (NOA) de las variaciones anuales de las demás regiones.</w:t>
             </w:r>
           </w:p>
         </w:tc>
@@ -3648,7 +3648,7 @@
               <w:rPr>
                 <w:rtl w:val="0"/>
               </w:rPr>
-              <w:t xml:space="preserve">Analizar la tendencia por región y no solo en el total nacional, y marcar 2024 como un episodio atípico en las visualizaciones.</w:t>
+              <w:t xml:space="preserve">Destacar al NOA como la región de mayor concentración y mostrar la evolución anual por región, marcando el NEA 2024 como episodio puntual.</w:t>
             </w:r>
           </w:p>
         </w:tc>
@@ -3848,1269 +3848,7 @@
               <w:rPr>
                 <w:rtl w:val="0"/>
               </w:rPr>
-              <w:t xml:space="preserve">Sí. Desagregar el NEA por provincia (en el Sprint 3) para identificar cuáles explican el pico. Verificar que los nombres de provincia estén unificados en la limpieza de datos.</w:t>
-            </w:r>
-          </w:p>
-        </w:tc>
-      </w:tr>
-    </w:tbl>
-    <w:p>
-      <w:r>
-        <w:br w:type="page"/>
-      </w:r>
-    </w:p>
-    <w:tbl>
-      <w:tblPr>
-        <w:tblStyle w:val="Table1"/>
-        <w:tblW w:w="9025.511811023624" w:type="dxa"/>
-        <w:jc w:val="left"/>
-        <w:tblBorders>
-          <w:top w:color="000000" w:space="0" w:sz="0" w:val="nil"/>
-          <w:left w:color="000000" w:space="0" w:sz="0" w:val="nil"/>
-          <w:bottom w:color="000000" w:space="0" w:sz="0" w:val="nil"/>
-          <w:right w:color="000000" w:space="0" w:sz="0" w:val="nil"/>
-          <w:insideH w:color="000000" w:space="0" w:sz="0" w:val="nil"/>
-          <w:insideV w:color="000000" w:space="0" w:sz="0" w:val="nil"/>
-        </w:tblBorders>
-        <w:tblLayout w:type="fixed"/>
-        <w:tblLook w:val="0600"/>
-      </w:tblPr>
-      <w:tblGrid>
-        <w:gridCol w:w="2282.810495333451"/>
-        <w:gridCol w:w="2210.7217428492368"/>
-        <w:gridCol w:w="4531.979572840935"/>
-        <w:tblGridChange w:id="0">
-          <w:tblGrid>
-            <w:gridCol w:w="2282.810495333451"/>
-            <w:gridCol w:w="2210.7217428492368"/>
-            <w:gridCol w:w="4531.979572840935"/>
-          </w:tblGrid>
-        </w:tblGridChange>
-      </w:tblGrid>
-      <w:tr>
-        <w:trPr>
-          <w:cantSplit w:val="1"/>
-          <w:tblHeader w:val="0"/>
-        </w:trPr>
-        <w:tc>
-          <w:tcPr>
-            <w:tcBorders>
-              <w:top w:color="000000" w:space="0" w:sz="6" w:val="single"/>
-              <w:left w:color="000000" w:space="0" w:sz="6" w:val="single"/>
-              <w:bottom w:color="000000" w:space="0" w:sz="6" w:val="single"/>
-              <w:right w:color="000000" w:space="0" w:sz="6" w:val="single"/>
-            </w:tcBorders>
-            <w:shd w:fill="d9d9d9" w:val="clear"/>
-            <w:tcMar>
-              <w:top w:w="100.0" w:type="dxa"/>
-              <w:left w:w="100.0" w:type="dxa"/>
-              <w:bottom w:w="100.0" w:type="dxa"/>
-              <w:right w:w="100.0" w:type="dxa"/>
-            </w:tcMar>
-            <w:vAlign w:val="center"/>
-          </w:tcPr>
-          <w:p>
-            <w:pPr>
-              <w:spacing w:line="240" w:lineRule="auto"/>
-              <w:jc w:val="center"/>
-              <w:rPr>
-                <w:b w:val="1"/>
-                <w:bCs w:val="1"/>
-              </w:rPr>
-            </w:pPr>
-            <w:r>
-              <w:rPr>
-                <w:b w:val="1"/>
-                <w:bCs w:val="1"/>
-                <w:rtl w:val="0"/>
-              </w:rPr>
-              <w:t xml:space="preserve">SECCIÓN</w:t>
-            </w:r>
-          </w:p>
-        </w:tc>
-        <w:tc>
-          <w:tcPr>
-            <w:tcBorders>
-              <w:top w:color="000000" w:space="0" w:sz="6" w:val="single"/>
-              <w:left w:color="000000" w:space="0" w:sz="6" w:val="single"/>
-              <w:bottom w:color="000000" w:space="0" w:sz="6" w:val="single"/>
-              <w:right w:color="000000" w:space="0" w:sz="6" w:val="single"/>
-            </w:tcBorders>
-            <w:shd w:fill="d9d9d9" w:val="clear"/>
-            <w:tcMar>
-              <w:top w:w="100.0" w:type="dxa"/>
-              <w:left w:w="100.0" w:type="dxa"/>
-              <w:bottom w:w="100.0" w:type="dxa"/>
-              <w:right w:w="100.0" w:type="dxa"/>
-            </w:tcMar>
-            <w:vAlign w:val="center"/>
-          </w:tcPr>
-          <w:p>
-            <w:pPr>
-              <w:spacing w:line="240" w:lineRule="auto"/>
-              <w:jc w:val="center"/>
-              <w:rPr>
-                <w:b w:val="1"/>
-                <w:bCs w:val="1"/>
-              </w:rPr>
-            </w:pPr>
-            <w:r>
-              <w:rPr>
-                <w:b w:val="1"/>
-                <w:bCs w:val="1"/>
-                <w:rtl w:val="0"/>
-              </w:rPr>
-              <w:t xml:space="preserve">CAMPO DE REGISTRO</w:t>
-            </w:r>
-          </w:p>
-        </w:tc>
-        <w:tc>
-          <w:tcPr>
-            <w:tcBorders>
-              <w:top w:color="000000" w:space="0" w:sz="6" w:val="single"/>
-              <w:left w:color="000000" w:space="0" w:sz="6" w:val="single"/>
-              <w:bottom w:color="000000" w:space="0" w:sz="6" w:val="single"/>
-              <w:right w:color="000000" w:space="0" w:sz="6" w:val="single"/>
-            </w:tcBorders>
-            <w:shd w:fill="d9d9d9" w:val="clear"/>
-            <w:tcMar>
-              <w:top w:w="100.0" w:type="dxa"/>
-              <w:left w:w="100.0" w:type="dxa"/>
-              <w:bottom w:w="100.0" w:type="dxa"/>
-              <w:right w:w="100.0" w:type="dxa"/>
-            </w:tcMar>
-            <w:vAlign w:val="center"/>
-          </w:tcPr>
-          <w:p>
-            <w:pPr>
-              <w:spacing w:line="240" w:lineRule="auto"/>
-              <w:jc w:val="center"/>
-              <w:rPr>
-                <w:b w:val="1"/>
-                <w:bCs w:val="1"/>
-              </w:rPr>
-            </w:pPr>
-            <w:r>
-              <w:rPr>
-                <w:b w:val="1"/>
-                <w:bCs w:val="1"/>
-                <w:rtl w:val="0"/>
-              </w:rPr>
-              <w:t xml:space="preserve">VALOR</w:t>
-            </w:r>
-          </w:p>
-        </w:tc>
-      </w:tr>
-      <w:tr>
-        <w:trPr>
-          <w:cantSplit w:val="1"/>
-          <w:trHeight w:val="420" w:hRule="atLeast"/>
-          <w:tblHeader w:val="0"/>
-        </w:trPr>
-        <w:tc>
-          <w:tcPr>
-            <w:vMerge w:val="restart"/>
-            <w:tcBorders>
-              <w:top w:color="000000" w:space="0" w:sz="6" w:val="single"/>
-              <w:left w:color="000000" w:space="0" w:sz="6" w:val="single"/>
-              <w:bottom w:color="000000" w:space="0" w:sz="6" w:val="single"/>
-              <w:right w:color="000000" w:space="0" w:sz="6" w:val="single"/>
-            </w:tcBorders>
-            <w:tcMar>
-              <w:top w:w="100.0" w:type="dxa"/>
-              <w:left w:w="100.0" w:type="dxa"/>
-              <w:bottom w:w="100.0" w:type="dxa"/>
-              <w:right w:w="100.0" w:type="dxa"/>
-            </w:tcMar>
-            <w:vAlign w:val="center"/>
-          </w:tcPr>
-          <w:p>
-            <w:pPr>
-              <w:spacing w:line="240" w:lineRule="auto"/>
-              <w:rPr>
-                <w:b w:val="1"/>
-                <w:bCs w:val="1"/>
-              </w:rPr>
-            </w:pPr>
-            <w:r>
-              <w:rPr>
-                <w:b w:val="1"/>
-                <w:bCs w:val="1"/>
-                <w:rtl w:val="0"/>
-              </w:rPr>
-              <w:t xml:space="preserve">Resumen Ejecutivo del Hallazgo</w:t>
-            </w:r>
-          </w:p>
-        </w:tc>
-        <w:tc>
-          <w:tcPr>
-            <w:tcBorders>
-              <w:top w:color="000000" w:space="0" w:sz="6" w:val="single"/>
-              <w:left w:color="000000" w:space="0" w:sz="6" w:val="single"/>
-              <w:bottom w:color="000000" w:space="0" w:sz="6" w:val="single"/>
-              <w:right w:color="000000" w:space="0" w:sz="6" w:val="single"/>
-            </w:tcBorders>
-            <w:tcMar>
-              <w:top w:w="100.0" w:type="dxa"/>
-              <w:left w:w="100.0" w:type="dxa"/>
-              <w:bottom w:w="100.0" w:type="dxa"/>
-              <w:right w:w="100.0" w:type="dxa"/>
-            </w:tcMar>
-            <w:vAlign w:val="top"/>
-          </w:tcPr>
-          <w:p>
-            <w:pPr>
-              <w:spacing w:line="240" w:lineRule="auto"/>
-              <w:rPr>
-                <w:b w:val="1"/>
-                <w:bCs w:val="1"/>
-              </w:rPr>
-            </w:pPr>
-            <w:r>
-              <w:rPr>
-                <w:b w:val="1"/>
-                <w:bCs w:val="1"/>
-                <w:rtl w:val="0"/>
-              </w:rPr>
-              <w:t xml:space="preserve">ID del Insight: </w:t>
-            </w:r>
-          </w:p>
-        </w:tc>
-        <w:tc>
-          <w:tcPr>
-            <w:tcBorders>
-              <w:top w:color="000000" w:space="0" w:sz="6" w:val="single"/>
-              <w:left w:color="000000" w:space="0" w:sz="6" w:val="single"/>
-              <w:bottom w:color="000000" w:space="0" w:sz="6" w:val="single"/>
-              <w:right w:color="000000" w:space="0" w:sz="6" w:val="single"/>
-            </w:tcBorders>
-            <w:tcMar>
-              <w:top w:w="100.0" w:type="dxa"/>
-              <w:left w:w="100.0" w:type="dxa"/>
-              <w:bottom w:w="100.0" w:type="dxa"/>
-              <w:right w:w="100.0" w:type="dxa"/>
-            </w:tcMar>
-            <w:vAlign w:val="top"/>
-          </w:tcPr>
-          <w:p>
-            <w:pPr>
-              <w:spacing w:line="240" w:lineRule="auto"/>
-              <w:rPr/>
-            </w:pPr>
-            <w:r>
-              <w:rPr>
-                <w:rtl w:val="0"/>
-              </w:rPr>
-              <w:t xml:space="preserve">INS-004</w:t>
-            </w:r>
-          </w:p>
-        </w:tc>
-      </w:tr>
-      <w:tr>
-        <w:trPr>
-          <w:cantSplit w:val="1"/>
-          <w:trHeight w:val="420" w:hRule="atLeast"/>
-          <w:tblHeader w:val="0"/>
-        </w:trPr>
-        <w:tc>
-          <w:tcPr>
-            <w:vMerge w:val="continue"/>
-            <w:tcBorders>
-              <w:top w:color="000000" w:space="0" w:sz="6" w:val="single"/>
-              <w:left w:color="000000" w:space="0" w:sz="6" w:val="single"/>
-              <w:bottom w:color="000000" w:space="0" w:sz="6" w:val="single"/>
-              <w:right w:color="000000" w:space="0" w:sz="6" w:val="single"/>
-            </w:tcBorders>
-            <w:tcMar>
-              <w:top w:w="100.0" w:type="dxa"/>
-              <w:left w:w="100.0" w:type="dxa"/>
-              <w:bottom w:w="100.0" w:type="dxa"/>
-              <w:right w:w="100.0" w:type="dxa"/>
-            </w:tcMar>
-            <w:vAlign w:val="center"/>
-          </w:tcPr>
-          <w:p>
-            <w:pPr>
-              <w:spacing w:line="240" w:lineRule="auto"/>
-              <w:jc w:val="both"/>
-              <w:rPr/>
-            </w:pPr>
-            <w:r>
-              <w:rPr>
-                <w:rtl w:val="0"/>
-              </w:rPr>
-            </w:r>
-          </w:p>
-        </w:tc>
-        <w:tc>
-          <w:tcPr>
-            <w:tcBorders>
-              <w:top w:color="000000" w:space="0" w:sz="6" w:val="single"/>
-              <w:left w:color="000000" w:space="0" w:sz="6" w:val="single"/>
-              <w:bottom w:color="000000" w:space="0" w:sz="6" w:val="single"/>
-              <w:right w:color="000000" w:space="0" w:sz="6" w:val="single"/>
-            </w:tcBorders>
-            <w:tcMar>
-              <w:top w:w="100.0" w:type="dxa"/>
-              <w:left w:w="100.0" w:type="dxa"/>
-              <w:bottom w:w="100.0" w:type="dxa"/>
-              <w:right w:w="100.0" w:type="dxa"/>
-            </w:tcMar>
-            <w:vAlign w:val="top"/>
-          </w:tcPr>
-          <w:p>
-            <w:pPr>
-              <w:spacing w:line="240" w:lineRule="auto"/>
-              <w:rPr>
-                <w:b w:val="1"/>
-                <w:bCs w:val="1"/>
-              </w:rPr>
-            </w:pPr>
-            <w:r>
-              <w:rPr>
-                <w:b w:val="1"/>
-                <w:bCs w:val="1"/>
-                <w:rtl w:val="0"/>
-              </w:rPr>
-              <w:t xml:space="preserve">Título Descriptivo: </w:t>
-            </w:r>
-          </w:p>
-        </w:tc>
-        <w:tc>
-          <w:tcPr>
-            <w:tcBorders>
-              <w:top w:color="000000" w:space="0" w:sz="6" w:val="single"/>
-              <w:left w:color="000000" w:space="0" w:sz="6" w:val="single"/>
-              <w:bottom w:color="000000" w:space="0" w:sz="6" w:val="single"/>
-              <w:right w:color="000000" w:space="0" w:sz="6" w:val="single"/>
-            </w:tcBorders>
-            <w:tcMar>
-              <w:top w:w="100.0" w:type="dxa"/>
-              <w:left w:w="100.0" w:type="dxa"/>
-              <w:bottom w:w="100.0" w:type="dxa"/>
-              <w:right w:w="100.0" w:type="dxa"/>
-            </w:tcMar>
-            <w:vAlign w:val="top"/>
-          </w:tcPr>
-          <w:p>
-            <w:pPr>
-              <w:spacing w:line="240" w:lineRule="auto"/>
-              <w:rPr/>
-            </w:pPr>
-            <w:r>
-              <w:rPr>
-                <w:rtl w:val="0"/>
-              </w:rPr>
-              <w:t xml:space="preserve">Los focos de calor satelitales casi no predicen los incendios registrados ni las hectáreas</w:t>
-            </w:r>
-          </w:p>
-        </w:tc>
-      </w:tr>
-      <w:tr>
-        <w:trPr>
-          <w:cantSplit w:val="1"/>
-          <w:trHeight w:val="420" w:hRule="atLeast"/>
-          <w:tblHeader w:val="0"/>
-        </w:trPr>
-        <w:tc>
-          <w:tcPr>
-            <w:vMerge w:val="continue"/>
-            <w:tcBorders>
-              <w:top w:color="000000" w:space="0" w:sz="6" w:val="single"/>
-              <w:left w:color="000000" w:space="0" w:sz="6" w:val="single"/>
-              <w:bottom w:color="000000" w:space="0" w:sz="6" w:val="single"/>
-              <w:right w:color="000000" w:space="0" w:sz="6" w:val="single"/>
-            </w:tcBorders>
-            <w:tcMar>
-              <w:top w:w="100.0" w:type="dxa"/>
-              <w:left w:w="100.0" w:type="dxa"/>
-              <w:bottom w:w="100.0" w:type="dxa"/>
-              <w:right w:w="100.0" w:type="dxa"/>
-            </w:tcMar>
-            <w:vAlign w:val="center"/>
-          </w:tcPr>
-          <w:p>
-            <w:pPr>
-              <w:spacing w:line="240" w:lineRule="auto"/>
-              <w:rPr/>
-            </w:pPr>
-            <w:r>
-              <w:rPr>
-                <w:rtl w:val="0"/>
-              </w:rPr>
-            </w:r>
-          </w:p>
-        </w:tc>
-        <w:tc>
-          <w:tcPr>
-            <w:tcBorders>
-              <w:top w:color="000000" w:space="0" w:sz="6" w:val="single"/>
-              <w:left w:color="000000" w:space="0" w:sz="6" w:val="single"/>
-              <w:bottom w:color="000000" w:space="0" w:sz="6" w:val="single"/>
-              <w:right w:color="000000" w:space="0" w:sz="6" w:val="single"/>
-            </w:tcBorders>
-            <w:tcMar>
-              <w:top w:w="100.0" w:type="dxa"/>
-              <w:left w:w="100.0" w:type="dxa"/>
-              <w:bottom w:w="100.0" w:type="dxa"/>
-              <w:right w:w="100.0" w:type="dxa"/>
-            </w:tcMar>
-            <w:vAlign w:val="top"/>
-          </w:tcPr>
-          <w:p>
-            <w:pPr>
-              <w:spacing w:line="240" w:lineRule="auto"/>
-              <w:rPr>
-                <w:b w:val="1"/>
-                <w:bCs w:val="1"/>
-              </w:rPr>
-            </w:pPr>
-            <w:r>
-              <w:rPr>
-                <w:b w:val="1"/>
-                <w:bCs w:val="1"/>
-                <w:rtl w:val="0"/>
-              </w:rPr>
-              <w:t xml:space="preserve">Categoría:</w:t>
-            </w:r>
-          </w:p>
-        </w:tc>
-        <w:tc>
-          <w:tcPr>
-            <w:tcBorders>
-              <w:top w:color="000000" w:space="0" w:sz="6" w:val="single"/>
-              <w:left w:color="000000" w:space="0" w:sz="6" w:val="single"/>
-              <w:bottom w:color="000000" w:space="0" w:sz="6" w:val="single"/>
-              <w:right w:color="000000" w:space="0" w:sz="6" w:val="single"/>
-            </w:tcBorders>
-            <w:tcMar>
-              <w:top w:w="100.0" w:type="dxa"/>
-              <w:left w:w="100.0" w:type="dxa"/>
-              <w:bottom w:w="100.0" w:type="dxa"/>
-              <w:right w:w="100.0" w:type="dxa"/>
-            </w:tcMar>
-            <w:vAlign w:val="top"/>
-          </w:tcPr>
-          <w:p>
-            <w:pPr>
-              <w:spacing w:line="240" w:lineRule="auto"/>
-              <w:rPr/>
-            </w:pPr>
-            <w:r>
-              <w:rPr>
-                <w:rtl w:val="0"/>
-              </w:rPr>
-              <w:t xml:space="preserve">Calidad y alcance de los datos</w:t>
-            </w:r>
-          </w:p>
-        </w:tc>
-      </w:tr>
-      <w:tr>
-        <w:trPr>
-          <w:cantSplit w:val="1"/>
-          <w:trHeight w:val="420" w:hRule="atLeast"/>
-          <w:tblHeader w:val="0"/>
-        </w:trPr>
-        <w:tc>
-          <w:tcPr>
-            <w:vMerge w:val="restart"/>
-            <w:tcBorders>
-              <w:top w:color="000000" w:space="0" w:sz="6" w:val="single"/>
-              <w:left w:color="000000" w:space="0" w:sz="6" w:val="single"/>
-              <w:bottom w:color="000000" w:space="0" w:sz="6" w:val="single"/>
-              <w:right w:color="000000" w:space="0" w:sz="6" w:val="single"/>
-            </w:tcBorders>
-            <w:tcMar>
-              <w:top w:w="100.0" w:type="dxa"/>
-              <w:left w:w="100.0" w:type="dxa"/>
-              <w:bottom w:w="100.0" w:type="dxa"/>
-              <w:right w:w="100.0" w:type="dxa"/>
-            </w:tcMar>
-            <w:vAlign w:val="center"/>
-          </w:tcPr>
-          <w:p>
-            <w:pPr>
-              <w:spacing w:line="240" w:lineRule="auto"/>
-              <w:rPr>
-                <w:b w:val="1"/>
-                <w:bCs w:val="1"/>
-              </w:rPr>
-            </w:pPr>
-            <w:r>
-              <w:rPr>
-                <w:b w:val="1"/>
-                <w:bCs w:val="1"/>
-                <w:rtl w:val="0"/>
-              </w:rPr>
-              <w:t xml:space="preserve">Contexto y Evidencia Estadística</w:t>
-            </w:r>
-          </w:p>
-        </w:tc>
-        <w:tc>
-          <w:tcPr>
-            <w:tcBorders>
-              <w:top w:color="000000" w:space="0" w:sz="6" w:val="single"/>
-              <w:left w:color="000000" w:space="0" w:sz="6" w:val="single"/>
-              <w:bottom w:color="000000" w:space="0" w:sz="6" w:val="single"/>
-              <w:right w:color="000000" w:space="0" w:sz="6" w:val="single"/>
-            </w:tcBorders>
-            <w:tcMar>
-              <w:top w:w="100.0" w:type="dxa"/>
-              <w:left w:w="100.0" w:type="dxa"/>
-              <w:bottom w:w="100.0" w:type="dxa"/>
-              <w:right w:w="100.0" w:type="dxa"/>
-            </w:tcMar>
-            <w:vAlign w:val="top"/>
-          </w:tcPr>
-          <w:p>
-            <w:pPr>
-              <w:spacing w:line="240" w:lineRule="auto"/>
-              <w:rPr>
-                <w:b w:val="1"/>
-                <w:bCs w:val="1"/>
-              </w:rPr>
-            </w:pPr>
-            <w:r>
-              <w:rPr>
-                <w:b w:val="1"/>
-                <w:bCs w:val="1"/>
-                <w:rtl w:val="0"/>
-              </w:rPr>
-              <w:t xml:space="preserve">Patrón Identificado:</w:t>
-            </w:r>
-          </w:p>
-        </w:tc>
-        <w:tc>
-          <w:tcPr>
-            <w:tcBorders>
-              <w:top w:color="000000" w:space="0" w:sz="6" w:val="single"/>
-              <w:left w:color="000000" w:space="0" w:sz="6" w:val="single"/>
-              <w:bottom w:color="000000" w:space="0" w:sz="6" w:val="single"/>
-              <w:right w:color="000000" w:space="0" w:sz="6" w:val="single"/>
-            </w:tcBorders>
-            <w:tcMar>
-              <w:top w:w="100.0" w:type="dxa"/>
-              <w:left w:w="100.0" w:type="dxa"/>
-              <w:bottom w:w="100.0" w:type="dxa"/>
-              <w:right w:w="100.0" w:type="dxa"/>
-            </w:tcMar>
-            <w:vAlign w:val="top"/>
-          </w:tcPr>
-          <w:p>
-            <w:pPr>
-              <w:rPr/>
-            </w:pPr>
-            <w:r>
-              <w:rPr>
-                <w:rtl w:val="0"/>
-              </w:rPr>
-              <w:t xml:space="preserve">A nivel provincia-año (2020–2025), la correlación de Spearman entre focos de calor e incendios registrados es -0,02, y entre focos de calor y hectáreas es 0,20. El año 2020 tuvo 405.904 focos de calor (unas 2,5 veces el promedio de los demás años), con grandes aumentos en Santa Fe, Formosa y Chaco, pero no fue el año con más hectáreas quemadas por incendio.</w:t>
-            </w:r>
-          </w:p>
-        </w:tc>
-      </w:tr>
-      <w:tr>
-        <w:trPr>
-          <w:cantSplit w:val="1"/>
-          <w:trHeight w:val="420" w:hRule="atLeast"/>
-          <w:tblHeader w:val="0"/>
-        </w:trPr>
-        <w:tc>
-          <w:tcPr>
-            <w:vMerge w:val="continue"/>
-            <w:tcBorders>
-              <w:top w:color="000000" w:space="0" w:sz="6" w:val="single"/>
-              <w:left w:color="000000" w:space="0" w:sz="6" w:val="single"/>
-              <w:bottom w:color="000000" w:space="0" w:sz="6" w:val="single"/>
-              <w:right w:color="000000" w:space="0" w:sz="6" w:val="single"/>
-            </w:tcBorders>
-            <w:tcMar>
-              <w:top w:w="100.0" w:type="dxa"/>
-              <w:left w:w="100.0" w:type="dxa"/>
-              <w:bottom w:w="100.0" w:type="dxa"/>
-              <w:right w:w="100.0" w:type="dxa"/>
-            </w:tcMar>
-            <w:vAlign w:val="center"/>
-          </w:tcPr>
-          <w:p>
-            <w:pPr>
-              <w:spacing w:line="240" w:lineRule="auto"/>
-              <w:rPr>
-                <w:b w:val="1"/>
-                <w:bCs w:val="1"/>
-              </w:rPr>
-            </w:pPr>
-            <w:r>
-              <w:rPr>
-                <w:rtl w:val="0"/>
-              </w:rPr>
-            </w:r>
-          </w:p>
-        </w:tc>
-        <w:tc>
-          <w:tcPr>
-            <w:tcBorders>
-              <w:top w:color="000000" w:space="0" w:sz="6" w:val="single"/>
-              <w:left w:color="000000" w:space="0" w:sz="6" w:val="single"/>
-              <w:bottom w:color="000000" w:space="0" w:sz="6" w:val="single"/>
-              <w:right w:color="000000" w:space="0" w:sz="6" w:val="single"/>
-            </w:tcBorders>
-            <w:tcMar>
-              <w:top w:w="100.0" w:type="dxa"/>
-              <w:left w:w="100.0" w:type="dxa"/>
-              <w:bottom w:w="100.0" w:type="dxa"/>
-              <w:right w:w="100.0" w:type="dxa"/>
-            </w:tcMar>
-            <w:vAlign w:val="top"/>
-          </w:tcPr>
-          <w:p>
-            <w:pPr>
-              <w:spacing w:line="240" w:lineRule="auto"/>
-              <w:rPr>
-                <w:b w:val="1"/>
-                <w:bCs w:val="1"/>
-              </w:rPr>
-            </w:pPr>
-            <w:r>
-              <w:rPr>
-                <w:b w:val="1"/>
-                <w:bCs w:val="1"/>
-                <w:rtl w:val="0"/>
-              </w:rPr>
-              <w:t xml:space="preserve">Variable(s) Crítica(s):</w:t>
-            </w:r>
-          </w:p>
-        </w:tc>
-        <w:tc>
-          <w:tcPr>
-            <w:tcBorders>
-              <w:top w:color="000000" w:space="0" w:sz="6" w:val="single"/>
-              <w:left w:color="000000" w:space="0" w:sz="6" w:val="single"/>
-              <w:bottom w:color="000000" w:space="0" w:sz="6" w:val="single"/>
-              <w:right w:color="000000" w:space="0" w:sz="6" w:val="single"/>
-            </w:tcBorders>
-            <w:tcMar>
-              <w:top w:w="100.0" w:type="dxa"/>
-              <w:left w:w="100.0" w:type="dxa"/>
-              <w:bottom w:w="100.0" w:type="dxa"/>
-              <w:right w:w="100.0" w:type="dxa"/>
-            </w:tcMar>
-            <w:vAlign w:val="top"/>
-          </w:tcPr>
-          <w:p>
-            <w:pPr>
-              <w:rPr/>
-            </w:pPr>
-            <w:r>
-              <w:rPr>
-                <w:rtl w:val="0"/>
-              </w:rPr>
-              <w:t xml:space="preserve">Focos de calor por provincia y año (rii_d), incendios por provincia (rii_b) y hectáreas por provincia (rii_c).</w:t>
-            </w:r>
-          </w:p>
-        </w:tc>
-      </w:tr>
-      <w:tr>
-        <w:trPr>
-          <w:cantSplit w:val="1"/>
-          <w:trHeight w:val="420" w:hRule="atLeast"/>
-          <w:tblHeader w:val="0"/>
-        </w:trPr>
-        <w:tc>
-          <w:tcPr>
-            <w:vMerge w:val="continue"/>
-            <w:tcBorders>
-              <w:top w:color="000000" w:space="0" w:sz="6" w:val="single"/>
-              <w:left w:color="000000" w:space="0" w:sz="6" w:val="single"/>
-              <w:bottom w:color="000000" w:space="0" w:sz="6" w:val="single"/>
-              <w:right w:color="000000" w:space="0" w:sz="6" w:val="single"/>
-            </w:tcBorders>
-            <w:tcMar>
-              <w:top w:w="100.0" w:type="dxa"/>
-              <w:left w:w="100.0" w:type="dxa"/>
-              <w:bottom w:w="100.0" w:type="dxa"/>
-              <w:right w:w="100.0" w:type="dxa"/>
-            </w:tcMar>
-            <w:vAlign w:val="center"/>
-          </w:tcPr>
-          <w:p>
-            <w:pPr>
-              <w:spacing w:line="240" w:lineRule="auto"/>
-              <w:rPr>
-                <w:b w:val="1"/>
-                <w:bCs w:val="1"/>
-              </w:rPr>
-            </w:pPr>
-            <w:r>
-              <w:rPr>
-                <w:rtl w:val="0"/>
-              </w:rPr>
-            </w:r>
-          </w:p>
-        </w:tc>
-        <w:tc>
-          <w:tcPr>
-            <w:tcBorders>
-              <w:top w:color="000000" w:space="0" w:sz="6" w:val="single"/>
-              <w:left w:color="000000" w:space="0" w:sz="6" w:val="single"/>
-              <w:bottom w:color="000000" w:space="0" w:sz="6" w:val="single"/>
-              <w:right w:color="000000" w:space="0" w:sz="6" w:val="single"/>
-            </w:tcBorders>
-            <w:tcMar>
-              <w:top w:w="100.0" w:type="dxa"/>
-              <w:left w:w="100.0" w:type="dxa"/>
-              <w:bottom w:w="100.0" w:type="dxa"/>
-              <w:right w:w="100.0" w:type="dxa"/>
-            </w:tcMar>
-            <w:vAlign w:val="top"/>
-          </w:tcPr>
-          <w:p>
-            <w:pPr>
-              <w:spacing w:line="240" w:lineRule="auto"/>
-              <w:rPr>
-                <w:b w:val="1"/>
-                <w:bCs w:val="1"/>
-              </w:rPr>
-            </w:pPr>
-            <w:r>
-              <w:rPr>
-                <w:b w:val="1"/>
-                <w:bCs w:val="1"/>
-                <w:rtl w:val="0"/>
-              </w:rPr>
-              <w:t xml:space="preserve">Grado de Confianza:</w:t>
-            </w:r>
-          </w:p>
-        </w:tc>
-        <w:tc>
-          <w:tcPr>
-            <w:tcBorders>
-              <w:top w:color="000000" w:space="0" w:sz="6" w:val="single"/>
-              <w:left w:color="000000" w:space="0" w:sz="6" w:val="single"/>
-              <w:bottom w:color="000000" w:space="0" w:sz="6" w:val="single"/>
-              <w:right w:color="000000" w:space="0" w:sz="6" w:val="single"/>
-            </w:tcBorders>
-            <w:tcMar>
-              <w:top w:w="100.0" w:type="dxa"/>
-              <w:left w:w="100.0" w:type="dxa"/>
-              <w:bottom w:w="100.0" w:type="dxa"/>
-              <w:right w:w="100.0" w:type="dxa"/>
-            </w:tcMar>
-            <w:vAlign w:val="top"/>
-          </w:tcPr>
-          <w:p>
-            <w:pPr>
-              <w:rPr/>
-            </w:pPr>
-            <w:r>
-              <w:rPr>
-                <w:rtl w:val="0"/>
-              </w:rPr>
-              <w:t xml:space="preserve">Medio. La relación es débil en los datos disponibles; no se pudo analizar el tipo de foco (incendio, quema agrícola u otro).</w:t>
-            </w:r>
-          </w:p>
-        </w:tc>
-      </w:tr>
-      <w:tr>
-        <w:trPr>
-          <w:cantSplit w:val="1"/>
-          <w:trHeight w:val="420" w:hRule="atLeast"/>
-          <w:tblHeader w:val="0"/>
-        </w:trPr>
-        <w:tc>
-          <w:tcPr>
-            <w:vMerge w:val="restart"/>
-            <w:tcBorders>
-              <w:top w:color="000000" w:space="0" w:sz="6" w:val="single"/>
-              <w:left w:color="000000" w:space="0" w:sz="6" w:val="single"/>
-              <w:bottom w:color="000000" w:space="0" w:sz="6" w:val="single"/>
-              <w:right w:color="000000" w:space="0" w:sz="6" w:val="single"/>
-            </w:tcBorders>
-            <w:tcMar>
-              <w:top w:w="100.0" w:type="dxa"/>
-              <w:left w:w="100.0" w:type="dxa"/>
-              <w:bottom w:w="100.0" w:type="dxa"/>
-              <w:right w:w="100.0" w:type="dxa"/>
-            </w:tcMar>
-            <w:vAlign w:val="center"/>
-          </w:tcPr>
-          <w:p>
-            <w:pPr>
-              <w:rPr>
-                <w:b w:val="1"/>
-                <w:bCs w:val="1"/>
-              </w:rPr>
-            </w:pPr>
-            <w:r>
-              <w:rPr>
-                <w:b w:val="1"/>
-                <w:bCs w:val="1"/>
-                <w:rtl w:val="0"/>
-              </w:rPr>
-              <w:t xml:space="preserve">El Insight (Conocimiento Profundo)</w:t>
-            </w:r>
-          </w:p>
-        </w:tc>
-        <w:tc>
-          <w:tcPr>
-            <w:tcBorders>
-              <w:top w:color="000000" w:space="0" w:sz="6" w:val="single"/>
-              <w:left w:color="000000" w:space="0" w:sz="6" w:val="single"/>
-              <w:bottom w:color="000000" w:space="0" w:sz="6" w:val="single"/>
-              <w:right w:color="000000" w:space="0" w:sz="6" w:val="single"/>
-            </w:tcBorders>
-            <w:tcMar>
-              <w:top w:w="100.0" w:type="dxa"/>
-              <w:left w:w="100.0" w:type="dxa"/>
-              <w:bottom w:w="100.0" w:type="dxa"/>
-              <w:right w:w="100.0" w:type="dxa"/>
-            </w:tcMar>
-            <w:vAlign w:val="top"/>
-          </w:tcPr>
-          <w:p>
-            <w:pPr>
-              <w:rPr>
-                <w:b w:val="1"/>
-                <w:bCs w:val="1"/>
-              </w:rPr>
-            </w:pPr>
-            <w:r>
-              <w:rPr>
-                <w:b w:val="1"/>
-                <w:bCs w:val="1"/>
-                <w:rtl w:val="0"/>
-              </w:rPr>
-              <w:t xml:space="preserve">Interpretación:</w:t>
-            </w:r>
-          </w:p>
-        </w:tc>
-        <w:tc>
-          <w:tcPr>
-            <w:tcBorders>
-              <w:top w:color="000000" w:space="0" w:sz="6" w:val="single"/>
-              <w:left w:color="000000" w:space="0" w:sz="6" w:val="single"/>
-              <w:bottom w:color="000000" w:space="0" w:sz="6" w:val="single"/>
-              <w:right w:color="000000" w:space="0" w:sz="6" w:val="single"/>
-            </w:tcBorders>
-            <w:tcMar>
-              <w:top w:w="100.0" w:type="dxa"/>
-              <w:left w:w="100.0" w:type="dxa"/>
-              <w:bottom w:w="100.0" w:type="dxa"/>
-              <w:right w:w="100.0" w:type="dxa"/>
-            </w:tcMar>
-            <w:vAlign w:val="top"/>
-          </w:tcPr>
-          <w:p>
-            <w:pPr>
-              <w:rPr/>
-            </w:pPr>
-            <w:r>
-              <w:rPr>
-                <w:rtl w:val="0"/>
-              </w:rPr>
-              <w:t xml:space="preserve">Los focos de calor y los incendios registrados miden fenómenos distintos. Parte de los focos puede corresponder a quemas agrícolas u otros eventos que no se registran como incendio forestal. Usarlos como sustituto del daño daría conclusiones equivocadas.</w:t>
-            </w:r>
-          </w:p>
-        </w:tc>
-      </w:tr>
-      <w:tr>
-        <w:trPr>
-          <w:cantSplit w:val="1"/>
-          <w:trHeight w:val="420" w:hRule="atLeast"/>
-          <w:tblHeader w:val="0"/>
-        </w:trPr>
-        <w:tc>
-          <w:tcPr>
-            <w:vMerge w:val="continue"/>
-            <w:tcBorders>
-              <w:top w:color="000000" w:space="0" w:sz="6" w:val="single"/>
-              <w:left w:color="000000" w:space="0" w:sz="6" w:val="single"/>
-              <w:bottom w:color="000000" w:space="0" w:sz="6" w:val="single"/>
-              <w:right w:color="000000" w:space="0" w:sz="6" w:val="single"/>
-            </w:tcBorders>
-            <w:tcMar>
-              <w:top w:w="100.0" w:type="dxa"/>
-              <w:left w:w="100.0" w:type="dxa"/>
-              <w:bottom w:w="100.0" w:type="dxa"/>
-              <w:right w:w="100.0" w:type="dxa"/>
-            </w:tcMar>
-            <w:vAlign w:val="center"/>
-          </w:tcPr>
-          <w:p>
-            <w:pPr>
-              <w:spacing w:line="240" w:lineRule="auto"/>
-              <w:rPr>
-                <w:b w:val="1"/>
-                <w:bCs w:val="1"/>
-              </w:rPr>
-            </w:pPr>
-            <w:r>
-              <w:rPr>
-                <w:rtl w:val="0"/>
-              </w:rPr>
-            </w:r>
-          </w:p>
-        </w:tc>
-        <w:tc>
-          <w:tcPr>
-            <w:tcBorders>
-              <w:top w:color="000000" w:space="0" w:sz="6" w:val="single"/>
-              <w:left w:color="000000" w:space="0" w:sz="6" w:val="single"/>
-              <w:bottom w:color="000000" w:space="0" w:sz="6" w:val="single"/>
-              <w:right w:color="000000" w:space="0" w:sz="6" w:val="single"/>
-            </w:tcBorders>
-            <w:tcMar>
-              <w:top w:w="100.0" w:type="dxa"/>
-              <w:left w:w="100.0" w:type="dxa"/>
-              <w:bottom w:w="100.0" w:type="dxa"/>
-              <w:right w:w="100.0" w:type="dxa"/>
-            </w:tcMar>
-            <w:vAlign w:val="top"/>
-          </w:tcPr>
-          <w:p>
-            <w:pPr>
-              <w:rPr>
-                <w:b w:val="1"/>
-                <w:bCs w:val="1"/>
-              </w:rPr>
-            </w:pPr>
-            <w:r>
-              <w:rPr>
-                <w:b w:val="1"/>
-                <w:bCs w:val="1"/>
-                <w:rtl w:val="0"/>
-              </w:rPr>
-              <w:t xml:space="preserve">Impacto Potencial: </w:t>
-            </w:r>
-          </w:p>
-        </w:tc>
-        <w:tc>
-          <w:tcPr>
-            <w:tcBorders>
-              <w:top w:color="000000" w:space="0" w:sz="6" w:val="single"/>
-              <w:left w:color="000000" w:space="0" w:sz="6" w:val="single"/>
-              <w:bottom w:color="000000" w:space="0" w:sz="6" w:val="single"/>
-              <w:right w:color="000000" w:space="0" w:sz="6" w:val="single"/>
-            </w:tcBorders>
-            <w:tcMar>
-              <w:top w:w="100.0" w:type="dxa"/>
-              <w:left w:w="100.0" w:type="dxa"/>
-              <w:bottom w:w="100.0" w:type="dxa"/>
-              <w:right w:w="100.0" w:type="dxa"/>
-            </w:tcMar>
-            <w:vAlign w:val="top"/>
-          </w:tcPr>
-          <w:p>
-            <w:pPr>
-              <w:rPr/>
-            </w:pPr>
-            <w:r>
-              <w:rPr>
-                <w:rtl w:val="0"/>
-              </w:rPr>
-              <w:t xml:space="preserve">Si se ignora, el informe podría mezclar ambos indicadores y sacar conclusiones erróneas. Si se actúa, cada indicador se usa para lo que mide y se declara su límite.</w:t>
-            </w:r>
-          </w:p>
-        </w:tc>
-      </w:tr>
-      <w:tr>
-        <w:trPr>
-          <w:cantSplit w:val="1"/>
-          <w:trHeight w:val="420" w:hRule="atLeast"/>
-          <w:tblHeader w:val="0"/>
-        </w:trPr>
-        <w:tc>
-          <w:tcPr>
-            <w:vMerge w:val="restart"/>
-            <w:tcBorders>
-              <w:top w:color="000000" w:space="0" w:sz="6" w:val="single"/>
-              <w:left w:color="000000" w:space="0" w:sz="6" w:val="single"/>
-              <w:bottom w:color="000000" w:space="0" w:sz="6" w:val="single"/>
-              <w:right w:color="000000" w:space="0" w:sz="6" w:val="single"/>
-            </w:tcBorders>
-            <w:tcMar>
-              <w:top w:w="100.0" w:type="dxa"/>
-              <w:left w:w="100.0" w:type="dxa"/>
-              <w:bottom w:w="100.0" w:type="dxa"/>
-              <w:right w:w="100.0" w:type="dxa"/>
-            </w:tcMar>
-            <w:vAlign w:val="center"/>
-          </w:tcPr>
-          <w:p>
-            <w:pPr>
-              <w:rPr>
-                <w:b w:val="1"/>
-                <w:bCs w:val="1"/>
-              </w:rPr>
-            </w:pPr>
-            <w:r>
-              <w:rPr>
-                <w:b w:val="1"/>
-                <w:bCs w:val="1"/>
-                <w:rtl w:val="0"/>
-              </w:rPr>
-              <w:t xml:space="preserve">Recomendaciones y Próximos Pasos (Accionabilidad)</w:t>
-            </w:r>
-          </w:p>
-        </w:tc>
-        <w:tc>
-          <w:tcPr>
-            <w:tcBorders>
-              <w:top w:color="000000" w:space="0" w:sz="6" w:val="single"/>
-              <w:left w:color="000000" w:space="0" w:sz="6" w:val="single"/>
-              <w:bottom w:color="000000" w:space="0" w:sz="6" w:val="single"/>
-              <w:right w:color="000000" w:space="0" w:sz="6" w:val="single"/>
-            </w:tcBorders>
-            <w:tcMar>
-              <w:top w:w="100.0" w:type="dxa"/>
-              <w:left w:w="100.0" w:type="dxa"/>
-              <w:bottom w:w="100.0" w:type="dxa"/>
-              <w:right w:w="100.0" w:type="dxa"/>
-            </w:tcMar>
-            <w:vAlign w:val="top"/>
-          </w:tcPr>
-          <w:p>
-            <w:pPr>
-              <w:rPr>
-                <w:b w:val="1"/>
-                <w:bCs w:val="1"/>
-              </w:rPr>
-            </w:pPr>
-            <w:r>
-              <w:rPr>
-                <w:b w:val="1"/>
-                <w:bCs w:val="1"/>
-                <w:rtl w:val="0"/>
-              </w:rPr>
-              <w:t xml:space="preserve">Acción Propuesta:</w:t>
-            </w:r>
-          </w:p>
-        </w:tc>
-        <w:tc>
-          <w:tcPr>
-            <w:tcBorders>
-              <w:top w:color="000000" w:space="0" w:sz="6" w:val="single"/>
-              <w:left w:color="000000" w:space="0" w:sz="6" w:val="single"/>
-              <w:bottom w:color="000000" w:space="0" w:sz="6" w:val="single"/>
-              <w:right w:color="000000" w:space="0" w:sz="6" w:val="single"/>
-            </w:tcBorders>
-            <w:tcMar>
-              <w:top w:w="100.0" w:type="dxa"/>
-              <w:left w:w="100.0" w:type="dxa"/>
-              <w:bottom w:w="100.0" w:type="dxa"/>
-              <w:right w:w="100.0" w:type="dxa"/>
-            </w:tcMar>
-            <w:vAlign w:val="top"/>
-          </w:tcPr>
-          <w:p>
-            <w:pPr>
-              <w:rPr/>
-            </w:pPr>
-            <w:r>
-              <w:rPr>
-                <w:rtl w:val="0"/>
-              </w:rPr>
-              <w:t xml:space="preserve">Usar los focos de calor solo como señal complementaria de actividad, y no como medida de la superficie quemada. Documentar esta limitación en el informe.</w:t>
-            </w:r>
-          </w:p>
-        </w:tc>
-      </w:tr>
-      <w:tr>
-        <w:trPr>
-          <w:cantSplit w:val="1"/>
-          <w:trHeight w:val="420" w:hRule="atLeast"/>
-          <w:tblHeader w:val="0"/>
-        </w:trPr>
-        <w:tc>
-          <w:tcPr>
-            <w:vMerge w:val="continue"/>
-            <w:tcBorders>
-              <w:top w:color="000000" w:space="0" w:sz="6" w:val="single"/>
-              <w:left w:color="000000" w:space="0" w:sz="6" w:val="single"/>
-              <w:bottom w:color="000000" w:space="0" w:sz="6" w:val="single"/>
-              <w:right w:color="000000" w:space="0" w:sz="6" w:val="single"/>
-            </w:tcBorders>
-            <w:tcMar>
-              <w:top w:w="100.0" w:type="dxa"/>
-              <w:left w:w="100.0" w:type="dxa"/>
-              <w:bottom w:w="100.0" w:type="dxa"/>
-              <w:right w:w="100.0" w:type="dxa"/>
-            </w:tcMar>
-            <w:vAlign w:val="center"/>
-          </w:tcPr>
-          <w:p>
-            <w:pPr>
-              <w:spacing w:line="240" w:lineRule="auto"/>
-              <w:rPr>
-                <w:b w:val="1"/>
-                <w:bCs w:val="1"/>
-              </w:rPr>
-            </w:pPr>
-            <w:r>
-              <w:rPr>
-                <w:rtl w:val="0"/>
-              </w:rPr>
-            </w:r>
-          </w:p>
-        </w:tc>
-        <w:tc>
-          <w:tcPr>
-            <w:tcBorders>
-              <w:top w:color="000000" w:space="0" w:sz="6" w:val="single"/>
-              <w:left w:color="000000" w:space="0" w:sz="6" w:val="single"/>
-              <w:bottom w:color="000000" w:space="0" w:sz="6" w:val="single"/>
-              <w:right w:color="000000" w:space="0" w:sz="6" w:val="single"/>
-            </w:tcBorders>
-            <w:tcMar>
-              <w:top w:w="100.0" w:type="dxa"/>
-              <w:left w:w="100.0" w:type="dxa"/>
-              <w:bottom w:w="100.0" w:type="dxa"/>
-              <w:right w:w="100.0" w:type="dxa"/>
-            </w:tcMar>
-            <w:vAlign w:val="top"/>
-          </w:tcPr>
-          <w:p>
-            <w:pPr>
-              <w:rPr>
-                <w:b w:val="1"/>
-                <w:bCs w:val="1"/>
-              </w:rPr>
-            </w:pPr>
-            <w:r>
-              <w:rPr>
-                <w:b w:val="1"/>
-                <w:bCs w:val="1"/>
-                <w:rtl w:val="0"/>
-              </w:rPr>
-              <w:t xml:space="preserve">Prioridad: </w:t>
-            </w:r>
-          </w:p>
-        </w:tc>
-        <w:tc>
-          <w:tcPr>
-            <w:tcBorders>
-              <w:top w:color="000000" w:space="0" w:sz="6" w:val="single"/>
-              <w:left w:color="000000" w:space="0" w:sz="6" w:val="single"/>
-              <w:bottom w:color="000000" w:space="0" w:sz="6" w:val="single"/>
-              <w:right w:color="000000" w:space="0" w:sz="6" w:val="single"/>
-            </w:tcBorders>
-            <w:tcMar>
-              <w:top w:w="100.0" w:type="dxa"/>
-              <w:left w:w="100.0" w:type="dxa"/>
-              <w:bottom w:w="100.0" w:type="dxa"/>
-              <w:right w:w="100.0" w:type="dxa"/>
-            </w:tcMar>
-            <w:vAlign w:val="top"/>
-          </w:tcPr>
-          <w:p>
-            <w:pPr>
-              <w:rPr/>
-            </w:pPr>
-            <w:r>
-              <w:rPr>
-                <w:rtl w:val="0"/>
-              </w:rPr>
-              <w:t xml:space="preserve">Media</w:t>
-            </w:r>
-          </w:p>
-        </w:tc>
-      </w:tr>
-      <w:tr>
-        <w:trPr>
-          <w:cantSplit w:val="1"/>
-          <w:trHeight w:val="1031.8505859375" w:hRule="atLeast"/>
-          <w:tblHeader w:val="0"/>
-        </w:trPr>
-        <w:tc>
-          <w:tcPr>
-            <w:vMerge w:val="continue"/>
-            <w:tcBorders>
-              <w:top w:color="000000" w:space="0" w:sz="6" w:val="single"/>
-              <w:left w:color="000000" w:space="0" w:sz="6" w:val="single"/>
-              <w:bottom w:color="000000" w:space="0" w:sz="6" w:val="single"/>
-              <w:right w:color="000000" w:space="0" w:sz="6" w:val="single"/>
-            </w:tcBorders>
-            <w:tcMar>
-              <w:top w:w="100.0" w:type="dxa"/>
-              <w:left w:w="100.0" w:type="dxa"/>
-              <w:bottom w:w="100.0" w:type="dxa"/>
-              <w:right w:w="100.0" w:type="dxa"/>
-            </w:tcMar>
-            <w:vAlign w:val="center"/>
-          </w:tcPr>
-          <w:p>
-            <w:pPr>
-              <w:spacing w:line="240" w:lineRule="auto"/>
-              <w:rPr>
-                <w:b w:val="1"/>
-                <w:bCs w:val="1"/>
-              </w:rPr>
-            </w:pPr>
-            <w:r>
-              <w:rPr>
-                <w:rtl w:val="0"/>
-              </w:rPr>
-            </w:r>
-          </w:p>
-        </w:tc>
-        <w:tc>
-          <w:tcPr>
-            <w:tcBorders>
-              <w:top w:color="000000" w:space="0" w:sz="6" w:val="single"/>
-              <w:left w:color="000000" w:space="0" w:sz="6" w:val="single"/>
-              <w:bottom w:color="000000" w:space="0" w:sz="6" w:val="single"/>
-              <w:right w:color="000000" w:space="0" w:sz="6" w:val="single"/>
-            </w:tcBorders>
-            <w:tcMar>
-              <w:top w:w="100.0" w:type="dxa"/>
-              <w:left w:w="100.0" w:type="dxa"/>
-              <w:bottom w:w="100.0" w:type="dxa"/>
-              <w:right w:w="100.0" w:type="dxa"/>
-            </w:tcMar>
-            <w:vAlign w:val="top"/>
-          </w:tcPr>
-          <w:p>
-            <w:pPr>
-              <w:rPr>
-                <w:b w:val="1"/>
-                <w:bCs w:val="1"/>
-              </w:rPr>
-            </w:pPr>
-            <w:r>
-              <w:rPr>
-                <w:b w:val="1"/>
-                <w:bCs w:val="1"/>
-                <w:rtl w:val="0"/>
-              </w:rPr>
-              <w:t xml:space="preserve">Sprint Futuro</w:t>
-            </w:r>
-          </w:p>
-        </w:tc>
-        <w:tc>
-          <w:tcPr>
-            <w:tcBorders>
-              <w:top w:color="000000" w:space="0" w:sz="6" w:val="single"/>
-              <w:left w:color="000000" w:space="0" w:sz="6" w:val="single"/>
-              <w:bottom w:color="000000" w:space="0" w:sz="6" w:val="single"/>
-              <w:right w:color="000000" w:space="0" w:sz="6" w:val="single"/>
-            </w:tcBorders>
-            <w:tcMar>
-              <w:top w:w="100.0" w:type="dxa"/>
-              <w:left w:w="100.0" w:type="dxa"/>
-              <w:bottom w:w="100.0" w:type="dxa"/>
-              <w:right w:w="100.0" w:type="dxa"/>
-            </w:tcMar>
-            <w:vAlign w:val="top"/>
-          </w:tcPr>
-          <w:p>
-            <w:pPr>
-              <w:rPr/>
-            </w:pPr>
-            <w:r>
-              <w:rPr>
-                <w:rtl w:val="0"/>
-              </w:rPr>
-              <w:t xml:space="preserve">Sí. Los datos de marzo de 2026 figuran en 0 en todo el país en el archivo mensual de focos de calor (parece dato faltante); excluirlos en la limpieza. Revisar también el valor atípico de Tierra del Fuego (93% de los focos en diciembre) antes de usarlo.</w:t>
+              <w:t xml:space="preserve">Sí. Para el Sprint 3, incorporar la comparación regional en la narrativa del producto de visualización y evaluar un nivel de detalle por provincia dentro del NOA y el NEA.</w:t>
             </w:r>
           </w:p>
         </w:tc>

</xml_diff>